<commit_message>
docs: tiempos realistas en guion; sorpresa solo al final
Comprime bloques de habla a duraciones naturales (~35–45s) y
reserva demo/físico para el tramo final sin adelantarlo.

Co-authored-by: CalehZzz <calebrenebr@gmail.com>
</commit_message>
<xml_diff>
--- a/docs/GUION_DEFENSA_15MIN.docx
+++ b/docs/GUION_DEFENSA_15MIN.docx
@@ -25,7 +25,7 @@
         <w:pStyle w:val="ListBullet"/>
       </w:pPr>
       <w:r>
-        <w:t>**Edgar** y **Caleb**: Colegio Don Bosco (pueden compartir pantalla desde sus PCs).</w:t>
+        <w:t>Edgar y Caleb: Colegio Don Bosco (pueden compartir pantalla desde sus PCs).</w:t>
       </w:r>
     </w:p>
     <w:p>
@@ -33,12 +33,27 @@
         <w:pStyle w:val="ListBullet"/>
       </w:pPr>
       <w:r>
-        <w:t>**Carla**: se conecta desde otro país (comparte su pantalla en su bloque).</w:t>
+        <w:t>Carla: se conecta desde otro país (comparte su pantalla en su bloque).</w:t>
       </w:r>
     </w:p>
     <w:p>
       <w:r>
         <w:t>Jurado: ingenieros Siemens (CR). Hablen técnico con seguridad; no “vendan humo”.</w:t>
+      </w:r>
+    </w:p>
+    <w:p>
+      <w:r>
+        <w:t>Regla de timing: los minutos abajo asumen habla natural (~140 palabras/min) + demos.</w:t>
+      </w:r>
+    </w:p>
+    <w:p>
+      <w:r>
+        <w:t>Si un bloque de texto se siente largo al ensayar, corten adornos, no corten TIA ni la demo.</w:t>
+      </w:r>
+    </w:p>
+    <w:p>
+      <w:r>
+        <w:t>Importante: no adelanten el cierre físico. Eso aparece solo al final.</w:t>
       </w:r>
     </w:p>
     <w:p>
@@ -105,7 +120,7 @@
           <w:rFonts w:ascii="Consolas" w:hAnsi="Consolas"/>
           <w:sz w:val="18"/>
         </w:rPr>
-        <w:t>Funcionamiento integral  ·  15  ·  Los 3 (demo + cierre físico)</w:t>
+        <w:t>Funcionamiento integral  ·  15  ·  Los 3 (demo al final del bloque Caleb + cierre)</w:t>
       </w:r>
     </w:p>
     <w:p>
@@ -114,7 +129,7 @@
           <w:rFonts w:ascii="Consolas" w:hAnsi="Consolas"/>
           <w:sz w:val="18"/>
         </w:rPr>
-        <w:t>Innovación y mejora técnica  ·  10  ·  **Caleb** (+ sorpresa física)</w:t>
+        <w:t>Innovación y mejora técnica  ·  10  ·  **Caleb**</w:t>
       </w:r>
     </w:p>
     <w:p>
@@ -172,7 +187,7 @@
           <w:rFonts w:ascii="Consolas" w:hAnsi="Consolas"/>
           <w:sz w:val="18"/>
         </w:rPr>
-        <w:t>Edgar  ·  Diapos “problema CR” + foto/idea de estación en colegio/parque</w:t>
+        <w:t>Edgar  ·  2–3 diapos: problema + sketch estación</w:t>
       </w:r>
     </w:p>
     <w:p>
@@ -181,7 +196,7 @@
           <w:rFonts w:ascii="Consolas" w:hAnsi="Consolas"/>
           <w:sz w:val="18"/>
         </w:rPr>
-        <w:t>Carla  ·  TIA V20 (LAD + DBs) + Automation Studio + KEPServer (si hay sim corriendo, mejor)</w:t>
+        <w:t>Carla  ·  TIA (OB1/FCs/DBs) + AS + KEP ya abiertos en ventanas</w:t>
       </w:r>
     </w:p>
     <w:p>
@@ -190,7 +205,7 @@
           <w:rFonts w:ascii="Consolas" w:hAnsi="Consolas"/>
           <w:sz w:val="18"/>
         </w:rPr>
-        <w:t>Caleb  ·  GitHub Pages / `index.html` + HMI + (opcional) bridge conectado</w:t>
+        <w:t>Caleb  ·  Web/HMI lista; pantalla completa ensayada</w:t>
       </w:r>
     </w:p>
     <w:p>
@@ -199,12 +214,12 @@
           <w:rFonts w:ascii="Consolas" w:hAnsi="Consolas"/>
           <w:sz w:val="18"/>
         </w:rPr>
-        <w:t>Los 3  ·  Zoom/Meet estable · micrófono · “sorpresa física” lista para el minuto 12</w:t>
+        <w:t>Los 3  ·  Zoom/Meet estable · mics · **mesa física lista pero fuera de cámara hasta el final**</w:t>
       </w:r>
     </w:p>
     <w:p>
       <w:r>
-        <w:t>Regla de oro virtual: quien habla, comparte pantalla. Cambio de turno = “te paso la pantalla / te doy el lead”.</w:t>
+        <w:t>Regla virtual: quien habla, comparte pantalla. Handoff &lt; 10 s.</w:t>
       </w:r>
     </w:p>
     <w:p>
@@ -217,7 +232,7 @@
         <w:pStyle w:val="Heading1"/>
       </w:pPr>
       <w:r>
-        <w:t>Reloj (15:00)</w:t>
+        <w:t>Reloj realista (15:00)</w:t>
       </w:r>
     </w:p>
     <w:p>
@@ -226,7 +241,7 @@
           <w:rFonts w:ascii="Consolas" w:hAnsi="Consolas"/>
           <w:sz w:val="18"/>
         </w:rPr>
-        <w:t>Min  ·  Bloque  ·  Quién  ·  Pantalla</w:t>
+        <w:t>Min  ·  Dur  ·  Bloque  ·  Quién</w:t>
       </w:r>
     </w:p>
     <w:p>
@@ -235,7 +250,7 @@
           <w:rFonts w:ascii="Consolas" w:hAnsi="Consolas"/>
           <w:sz w:val="18"/>
         </w:rPr>
-        <w:t>0:00–0:50  ·  Hook / apertura  ·  Edgar  ·  Edgar</w:t>
+        <w:t>0:00–0:35  ·  35s  ·  Hook  ·  Edgar</w:t>
       </w:r>
     </w:p>
     <w:p>
@@ -244,7 +259,7 @@
           <w:rFonts w:ascii="Consolas" w:hAnsi="Consolas"/>
           <w:sz w:val="18"/>
         </w:rPr>
-        <w:t>0:50–3:40  ·  Problemática + propuesta SIBU  ·  Edgar  ·  Edgar</w:t>
+        <w:t>0:35–0:50  ·  15s  ·  Quiénes somos  ·  Edgar</w:t>
       </w:r>
     </w:p>
     <w:p>
@@ -253,7 +268,7 @@
           <w:rFonts w:ascii="Consolas" w:hAnsi="Consolas"/>
           <w:sz w:val="18"/>
         </w:rPr>
-        <w:t>3:40–4:00  ·  Puente a Carla  ·  Edgar → Carla  ·  —</w:t>
+        <w:t>0:50–1:30  ·  40s  ·  Problemática (3 fallas)  ·  Edgar</w:t>
       </w:r>
     </w:p>
     <w:p>
@@ -262,7 +277,7 @@
           <w:rFonts w:ascii="Consolas" w:hAnsi="Consolas"/>
           <w:sz w:val="18"/>
         </w:rPr>
-        <w:t>4:00–9:10  ·  TIA + AS + KEPServer  ·  Carla  ·  **Carla**</w:t>
+        <w:t>1:30–2:15  ·  45s  ·  Propuesta + 3 capas  ·  Edgar</w:t>
       </w:r>
     </w:p>
     <w:p>
@@ -271,7 +286,7 @@
           <w:rFonts w:ascii="Consolas" w:hAnsi="Consolas"/>
           <w:sz w:val="18"/>
         </w:rPr>
-        <w:t>9:10–9:25  ·  Puente a Caleb  ·  Carla → Caleb  ·  —</w:t>
+        <w:t>2:15–2:25  ·  10s  ·  Handoff → Carla  ·  Edgar</w:t>
       </w:r>
     </w:p>
     <w:p>
@@ -280,7 +295,7 @@
           <w:rFonts w:ascii="Consolas" w:hAnsi="Consolas"/>
           <w:sz w:val="18"/>
         </w:rPr>
-        <w:t>9:25–12:10  ·  Innovación web / HMI  ·  Caleb  ·  **Caleb**</w:t>
+        <w:t>2:25–3:00  ·  35s  ·  Stack / diagrama AS–KEP–TIA  ·  Carla</w:t>
       </w:r>
     </w:p>
     <w:p>
@@ -289,7 +304,7 @@
           <w:rFonts w:ascii="Consolas" w:hAnsi="Consolas"/>
           <w:sz w:val="18"/>
         </w:rPr>
-        <w:t>12:10–14:10  ·  Funcionamiento integral + **sorpresa física**  ·  Caleb + Edgar (+ Carla comenta)  ·  Caleb / cámara física</w:t>
+        <w:t>3:00–4:45  ·  1:45  ·  TIA: FCs + detalle + 30–40s mostrando LAD  ·  Carla</w:t>
       </w:r>
     </w:p>
     <w:p>
@@ -298,12 +313,84 @@
           <w:rFonts w:ascii="Consolas" w:hAnsi="Consolas"/>
           <w:sz w:val="18"/>
         </w:rPr>
-        <w:t>14:10–15:00  ·  Cierre memorable  ·  Edgar (+ 1 línea cada uno)  ·  Edgar</w:t>
+        <w:t>4:45–5:50  ·  1:05  ·  AS + KEP (40s habla + 25s mostrar circuito)  ·  Carla</w:t>
       </w:r>
     </w:p>
     <w:p>
       <w:r>
-        <w:t>Si se atrasan: corten adornos, no corten TIA (20 pts) ni la demo integral.</w:t>
+        <w:rPr>
+          <w:rFonts w:ascii="Consolas" w:hAnsi="Consolas"/>
+          <w:sz w:val="18"/>
+        </w:rPr>
+        <w:t>5:50–6:00  ·  10s  ·  Handoff → Caleb  ·  Carla</w:t>
+      </w:r>
+    </w:p>
+    <w:p>
+      <w:r>
+        <w:rPr>
+          <w:rFonts w:ascii="Consolas" w:hAnsi="Consolas"/>
+          <w:sz w:val="18"/>
+        </w:rPr>
+        <w:t>6:00–6:40  ·  40s  ·  Innovación: por qué web  ·  Caleb</w:t>
+      </w:r>
+    </w:p>
+    <w:p>
+      <w:r>
+        <w:rPr>
+          <w:rFonts w:ascii="Consolas" w:hAnsi="Consolas"/>
+          <w:sz w:val="18"/>
+        </w:rPr>
+        <w:t>6:40–8:10  ·  1:30  ·  HMI: explicación 40s + clicks en vivo 50s  ·  Caleb</w:t>
+      </w:r>
+    </w:p>
+    <w:p>
+      <w:r>
+        <w:rPr>
+          <w:rFonts w:ascii="Consolas" w:hAnsi="Consolas"/>
+          <w:sz w:val="18"/>
+        </w:rPr>
+        <w:t>8:10–8:35  ·  25s  ·  3 mejoras técnicas  ·  Caleb</w:t>
+      </w:r>
+    </w:p>
+    <w:p>
+      <w:r>
+        <w:rPr>
+          <w:rFonts w:ascii="Consolas" w:hAnsi="Consolas"/>
+          <w:sz w:val="18"/>
+        </w:rPr>
+        <w:t>8:35–9:00  ·  25s  ·  Ciclo integral (narrado)  ·  Caleb</w:t>
+      </w:r>
+    </w:p>
+    <w:p>
+      <w:r>
+        <w:rPr>
+          <w:rFonts w:ascii="Consolas" w:hAnsi="Consolas"/>
+          <w:sz w:val="18"/>
+        </w:rPr>
+        <w:t>9:00–12:30  ·  3:30  ·  **Demo integral en vivo** (PLC/AS/web según lo que corra)  ·  Caleb + Carla</w:t>
+      </w:r>
+    </w:p>
+    <w:p>
+      <w:r>
+        <w:rPr>
+          <w:rFonts w:ascii="Consolas" w:hAnsi="Consolas"/>
+          <w:sz w:val="18"/>
+        </w:rPr>
+        <w:t>12:30–14:20  ·  1:50  ·  **Cierre físico** (primera mención)  ·  Edgar + Caleb (+ Carla 10s)</w:t>
+      </w:r>
+    </w:p>
+    <w:p>
+      <w:r>
+        <w:rPr>
+          <w:rFonts w:ascii="Consolas" w:hAnsi="Consolas"/>
+          <w:sz w:val="18"/>
+        </w:rPr>
+        <w:t>14:20–15:00  ·  40s  ·  Cierre + gracias  ·  Edgar (+ 1 línea c/u)</w:t>
+      </w:r>
+    </w:p>
+    <w:p>
+      <w:r>
+        <w:t>Si la demo integral se atrasa: recorten el tramo 9:00–12:30, no el físico ni el cierre.</w:t>
       </w:r>
     </w:p>
     <w:p>
@@ -316,15 +403,7 @@
         <w:pStyle w:val="Title"/>
       </w:pPr>
       <w:r>
-        <w:t>BLOQUE 1 — Edgar (0:00 → 3:40)</w:t>
-      </w:r>
-    </w:p>
-    <w:p>
-      <w:pPr>
-        <w:pStyle w:val="Heading1"/>
-      </w:pPr>
-      <w:r>
-        <w:t>Captar atención + problemática + propuesta · ~10 pts análisis + comunicación</w:t>
+        <w:t>BLOQUE 1 — Edgar (0:00 → 2:25)</w:t>
       </w:r>
     </w:p>
     <w:p>
@@ -332,12 +411,12 @@
         <w:pStyle w:val="Heading2"/>
       </w:pPr>
       <w:r>
-        <w:t>0:00–0:50 · Hook (no digan “buenas, nosotros somos…”)</w:t>
+        <w:t>0:00–0:35 · Hook (~35 s)</w:t>
       </w:r>
     </w:p>
     <w:p>
       <w:r>
-        <w:t>Edgar (mirando a cámara, sin diapos al inicio o con una sola imagen fuerte: basura en parque / colegio):</w:t>
+        <w:t>Edgar (cámara; 1 imagen fuerte opcional):</w:t>
       </w:r>
     </w:p>
     <w:p>
@@ -348,7 +427,7 @@
         <w:rPr>
           <w:i/>
         </w:rPr>
-        <w:t>“Ingenieros: imaginen un colegio en San José un viernes a las 2 de la tarde.</w:t>
+        <w:t>“Ingenieros: imaginen un colegio en San José un viernes a las 2.</w:t>
       </w:r>
     </w:p>
     <w:p>
@@ -370,7 +449,7 @@
         <w:rPr>
           <w:i/>
         </w:rPr>
-        <w:t>No es que la gente no sepa reciclar. Es que **reciclar no da feedback**.</w:t>
+        <w:t>No es que la gente no sepa reciclar. Es que reciclar no da feedback: no pesa, no clasifica, no premia.</w:t>
       </w:r>
     </w:p>
     <w:p>
@@ -381,7 +460,15 @@
         <w:rPr>
           <w:i/>
         </w:rPr>
-        <w:t>No pesa, no clasifica, no premia, no deja evidencia.</w:t>
+        <w:t>Hoy les presentamos SIBU: una estación que convierte el reciclaje en un proceso medible y en una recompensa.”</w:t>
+      </w:r>
+    </w:p>
+    <w:p>
+      <w:pPr>
+        <w:pStyle w:val="Heading2"/>
+      </w:pPr>
+      <w:r>
+        <w:t>0:35–0:50 · Equipo (~15 s)</w:t>
       </w:r>
     </w:p>
     <w:p>
@@ -392,12 +479,7 @@
         <w:rPr>
           <w:i/>
         </w:rPr>
-        <w:t>Hoy les presentamos **SIBU**: una estación de clasificación y pesaje que convierte el reciclaje en un proceso medible — y en una recompensa.”</w:t>
-      </w:r>
-    </w:p>
-    <w:p>
-      <w:r>
-        <w:t>*(Pausa 1 segundo. Sonrían. Luego sí: presentaciones cortas.)*</w:t>
+        <w:t>“Equipo Guacamayos, Colegio Don Bosco.</w:t>
       </w:r>
     </w:p>
     <w:p>
@@ -408,7 +490,7 @@
         <w:rPr>
           <w:i/>
         </w:rPr>
-        <w:t>“Somos el equipo Guacamayos — Colegio Don Bosco.</w:t>
+        <w:t>Yo soy Edgar. Conmigo está Caleb.</w:t>
       </w:r>
     </w:p>
     <w:p>
@@ -419,7 +501,15 @@
         <w:rPr>
           <w:i/>
         </w:rPr>
-        <w:t>Yo soy **Edgar**. Conmigo están **Caleb**, aquí en el colegio.</w:t>
+        <w:t>En remoto, Carla, que les abre el núcleo Siemens.”</w:t>
+      </w:r>
+    </w:p>
+    <w:p>
+      <w:pPr>
+        <w:pStyle w:val="Heading2"/>
+      </w:pPr>
+      <w:r>
+        <w:t>0:50–1:30 · Problemática (~40 s)</w:t>
       </w:r>
     </w:p>
     <w:p>
@@ -430,20 +520,7 @@
         <w:rPr>
           <w:i/>
         </w:rPr>
-        <w:t>Y en remoto, desde otro país, **Carla**, que les va a mostrar el corazón Siemens del sistema.”</w:t>
-      </w:r>
-    </w:p>
-    <w:p>
-      <w:pPr>
-        <w:pStyle w:val="Heading2"/>
-      </w:pPr>
-      <w:r>
-        <w:t>0:50–2:40 · Problemática (cultura de reciclaje → problema de ingeniería)</w:t>
-      </w:r>
-    </w:p>
-    <w:p>
-      <w:r>
-        <w:t>Edgar (diapos 2–3: datos locales / observación, no ensayo):</w:t>
+        <w:t>“En la práctica el reciclaje escolar y comunitario falla en tres cosas de ingeniería:</w:t>
       </w:r>
     </w:p>
     <w:p>
@@ -454,7 +531,7 @@
         <w:rPr>
           <w:i/>
         </w:rPr>
-        <w:t>“En Costa Rica hablamos mucho de sostenibilidad, pero en la práctica el reciclaje escolar y comunitario tiene tres fallas de ingeniería:</w:t>
+        <w:t>uno, clasificación inconsistente;</w:t>
       </w:r>
     </w:p>
     <w:p>
@@ -465,7 +542,7 @@
         <w:rPr>
           <w:i/>
         </w:rPr>
-        <w:t>1) **Clasificación inconsistente** — plástico y aluminio se mezclan.</w:t>
+        <w:t>dos, sin medición — ni peso ni sesión;</w:t>
       </w:r>
     </w:p>
     <w:p>
@@ -476,7 +553,7 @@
         <w:rPr>
           <w:i/>
         </w:rPr>
-        <w:t>2) **Sin medición** — no hay peso, no hay contadores, no hay sesión.</w:t>
+        <w:t>tres, sin incentivo cerrado — el usuario no ve resultado.</w:t>
       </w:r>
     </w:p>
     <w:p>
@@ -487,7 +564,227 @@
         <w:rPr>
           <w:i/>
         </w:rPr>
-        <w:t>3) **Sin incentivo cerrado** — el usuario no ve un resultado inmediato.</w:t>
+        <w:t>Eso no se arregla con un afiche. Se arregla con automatización y una interfaz que sí se use.”</w:t>
+      </w:r>
+    </w:p>
+    <w:p>
+      <w:pPr>
+        <w:pStyle w:val="Heading2"/>
+      </w:pPr>
+      <w:r>
+        <w:t>1:30–2:15 · Propuesta (~45 s)</w:t>
+      </w:r>
+    </w:p>
+    <w:p>
+      <w:pPr>
+        <w:ind w:left="360"/>
+      </w:pPr>
+      <w:r>
+        <w:rPr>
+          <w:i/>
+        </w:rPr>
+        <w:t>“Propuesta: una estación modular SIBU para colegio, parque o centro comunal.</w:t>
+      </w:r>
+    </w:p>
+    <w:p>
+      <w:pPr>
+        <w:ind w:left="360"/>
+      </w:pPr>
+      <w:r>
+        <w:rPr>
+          <w:i/>
+        </w:rPr>
+        <w:t>Flujo: pieza → báscula → banda → sensor de material → separación → app con piezas, kilos y colones.</w:t>
+      </w:r>
+    </w:p>
+    <w:p>
+      <w:pPr>
+        <w:ind w:left="360"/>
+      </w:pPr>
+      <w:r>
+        <w:rPr>
+          <w:i/>
+        </w:rPr>
+        <w:t>Tres capas: electroneumática en Automation Studio, cerebro en TIA Portal, innovación en HMI/app web que habla con el PLC.</w:t>
+      </w:r>
+    </w:p>
+    <w:p>
+      <w:pPr>
+        <w:ind w:left="360"/>
+      </w:pPr>
+      <w:r>
+        <w:rPr>
+          <w:i/>
+        </w:rPr>
+        <w:t>Carla les muestra el PLC y el circuito. Caleb, la capa que toca el usuario.”</w:t>
+      </w:r>
+    </w:p>
+    <w:p>
+      <w:pPr>
+        <w:pStyle w:val="Heading2"/>
+      </w:pPr>
+      <w:r>
+        <w:t>2:15–2:25 · Handoff (~10 s)</w:t>
+      </w:r>
+    </w:p>
+    <w:p>
+      <w:pPr>
+        <w:ind w:left="360"/>
+      </w:pPr>
+      <w:r>
+        <w:rPr>
+          <w:i/>
+        </w:rPr>
+        <w:t>“Carla, te paso el lead: LAD, timers y el bus de datos.”</w:t>
+      </w:r>
+    </w:p>
+    <w:p>
+      <w:r>
+        <w:t>────────────────────────────────────────</w:t>
+      </w:r>
+    </w:p>
+    <w:p>
+      <w:pPr>
+        <w:pStyle w:val="Title"/>
+      </w:pPr>
+      <w:r>
+        <w:t>BLOQUE 2 — Carla (2:25 → 6:00)</w:t>
+      </w:r>
+    </w:p>
+    <w:p>
+      <w:pPr>
+        <w:pStyle w:val="Heading2"/>
+      </w:pPr>
+      <w:r>
+        <w:t>2:25–3:00 · Stack (~35 s)</w:t>
+      </w:r>
+    </w:p>
+    <w:p>
+      <w:r>
+        <w:t>Carla (diagrama AS ↔ KEP ↔ TIA):</w:t>
+      </w:r>
+    </w:p>
+    <w:p>
+      <w:pPr>
+        <w:ind w:left="360"/>
+      </w:pPr>
+      <w:r>
+        <w:rPr>
+          <w:i/>
+        </w:rPr>
+        <w:t>“Soy Carla.</w:t>
+      </w:r>
+    </w:p>
+    <w:p>
+      <w:pPr>
+        <w:ind w:left="360"/>
+      </w:pPr>
+      <w:r>
+        <w:rPr>
+          <w:i/>
+        </w:rPr>
+        <w:t>Stack: TIA V20, CPU 1511C en PLCSIM Advanced, Automation Studio 10, KEPServerEX 6.</w:t>
+      </w:r>
+    </w:p>
+    <w:p>
+      <w:pPr>
+        <w:ind w:left="360"/>
+      </w:pPr>
+      <w:r>
+        <w:rPr>
+          <w:i/>
+        </w:rPr>
+        <w:t>AS no habla S7 a gusto; KEP mueve tags a memorias del PLC.</w:t>
+      </w:r>
+    </w:p>
+    <w:p>
+      <w:pPr>
+        <w:ind w:left="360"/>
+      </w:pPr>
+      <w:r>
+        <w:rPr>
+          <w:i/>
+        </w:rPr>
+        <w:t>En sim usamos %M con AS.</w:t>
+      </w:r>
+    </w:p>
+    <w:p>
+      <w:pPr>
+        <w:ind w:left="360"/>
+      </w:pPr>
+      <w:r>
+        <w:rPr>
+          <w:i/>
+        </w:rPr>
+        <w:t>La web escribe DB_HMI y lee DatosEstacion — no pisa I/Q a ciegas.”</w:t>
+      </w:r>
+    </w:p>
+    <w:p>
+      <w:pPr>
+        <w:pStyle w:val="Heading2"/>
+      </w:pPr>
+      <w:r>
+        <w:t>3:00–4:45 · TIA Portal (~1:45 = ~60–70 s habla + 30–40 s mostrando)</w:t>
+      </w:r>
+    </w:p>
+    <w:p>
+      <w:r>
+        <w:t>Carla (OB1 + FCs en pantalla):</w:t>
+      </w:r>
+    </w:p>
+    <w:p>
+      <w:pPr>
+        <w:ind w:left="360"/>
+      </w:pPr>
+      <w:r>
+        <w:rPr>
+          <w:i/>
+        </w:rPr>
+        <w:t>“Cuatro funciones:</w:t>
+      </w:r>
+    </w:p>
+    <w:p>
+      <w:pPr>
+        <w:ind w:left="360"/>
+      </w:pPr>
+      <w:r>
+        <w:rPr>
+          <w:i/>
+        </w:rPr>
+        <w:t>FC_Modos — Start, Stop, emergencia, auto.</w:t>
+      </w:r>
+    </w:p>
+    <w:p>
+      <w:pPr>
+        <w:ind w:left="360"/>
+      </w:pPr>
+      <w:r>
+        <w:rPr>
+          <w:i/>
+        </w:rPr>
+        <w:t>FC_Secuencia — banda, material, clasificación, conteo.</w:t>
+      </w:r>
+    </w:p>
+    <w:p>
+      <w:pPr>
+        <w:ind w:left="360"/>
+      </w:pPr>
+      <w:r>
+        <w:rPr>
+          <w:i/>
+        </w:rPr>
+        <w:t>FC_Alarmas — timeout y sensores contradictorios.</w:t>
+      </w:r>
+    </w:p>
+    <w:p>
+      <w:pPr>
+        <w:ind w:left="360"/>
+      </w:pPr>
+      <w:r>
+        <w:rPr>
+          <w:i/>
+        </w:rPr>
+        <w:t>FC_EspejoWeb — estado a DatosEstacion.</w:t>
       </w:r>
     </w:p>
     <w:p>
@@ -503,7 +800,12 @@
         <w:rPr>
           <w:i/>
         </w:rPr>
-        <w:t>Eso no se resuelve con un afiche. Se resuelve con **automatización + una interfaz que la gente sí use**.”</w:t>
+        <w:t>Detalles que importan: una bobina por actuador con AUTO // MANUAL en paralelo; TON IEC de retardo y timeout; DBs con Optimized OFF por offsets de snap7; comandos en DB3, estado en DB1.”</w:t>
+      </w:r>
+    </w:p>
+    <w:p>
+      <w:r>
+        <w:t>*(Ahora sí: 30–40 s ONLINE / un network grande / un ciclo corto. No narren encima todo el tiempo.)*</w:t>
       </w:r>
     </w:p>
     <w:p>
@@ -511,12 +813,12 @@
         <w:pStyle w:val="Heading2"/>
       </w:pPr>
       <w:r>
-        <w:t>2:40–3:40 · Propuesta (estación replicable)</w:t>
+        <w:t>4:45–5:50 · AS + KEP (~1:05)</w:t>
       </w:r>
     </w:p>
     <w:p>
       <w:r>
-        <w:t>Edgar (diapos: sketch estación en colegio / parque):</w:t>
+        <w:t>Carla (AS visible):</w:t>
       </w:r>
     </w:p>
     <w:p>
@@ -527,7 +829,7 @@
         <w:rPr>
           <w:i/>
         </w:rPr>
-        <w:t>“Nuestra propuesta: una **estación modular SIBU** que se pueda instalar en un colegio, un parque o un centro comunal.</w:t>
+        <w:t>“En AS: aire → 5/2 → cilindro doble efecto → sensores 0% / 100%.</w:t>
       </w:r>
     </w:p>
     <w:p>
@@ -538,12 +840,7 @@
         <w:rPr>
           <w:i/>
         </w:rPr>
-        <w:t>Flujo: la persona deja la pieza → se pesa → la banda avanza → sensores identifican material → actuadores separan → la app acumula piezas, kilos y una recompensa en colones.</w:t>
-      </w:r>
-    </w:p>
-    <w:p>
-      <w:r>
-        <w:t>&gt;</w:t>
+        <w:t>KEP enlaza a tags del PLC.</w:t>
       </w:r>
     </w:p>
     <w:p>
@@ -554,7 +851,7 @@
         <w:rPr>
           <w:i/>
         </w:rPr>
-        <w:t>Arquitectura en tres capas, como les gusta a Siemens:</w:t>
+        <w:t>El PLC manda solenoide; AS mueve; el sensor vuelve; la secuencia avanza.</w:t>
       </w:r>
     </w:p>
     <w:p>
@@ -565,7 +862,20 @@
         <w:rPr>
           <w:i/>
         </w:rPr>
-        <w:t>- **Campo / simulación:** electroneumática en Automation Studio</w:t>
+        <w:t>Feedback de proceso, no animación suelta.”</w:t>
+      </w:r>
+    </w:p>
+    <w:p>
+      <w:r>
+        <w:t>*(25 s mostrando el cilindro moverse o el enlace de tags.)*</w:t>
+      </w:r>
+    </w:p>
+    <w:p>
+      <w:pPr>
+        <w:pStyle w:val="Heading2"/>
+      </w:pPr>
+      <w:r>
+        <w:t>5:50–6:00 · Handoff (~10 s)</w:t>
       </w:r>
     </w:p>
     <w:p>
@@ -576,7 +886,7 @@
         <w:rPr>
           <w:i/>
         </w:rPr>
-        <w:t>- **Cerebro:** PLC en TIA Portal</w:t>
+        <w:t>“Cerebro Siemens y músculo neumático listos.</w:t>
       </w:r>
     </w:p>
     <w:p>
@@ -587,50 +897,7 @@
         <w:rPr>
           <w:i/>
         </w:rPr>
-        <w:t>- **Innovación:** HMI y app web que habla con el PLC</w:t>
-      </w:r>
-    </w:p>
-    <w:p>
-      <w:r>
-        <w:t>&gt;</w:t>
-      </w:r>
-    </w:p>
-    <w:p>
-      <w:pPr>
-        <w:ind w:left="360"/>
-      </w:pPr>
-      <w:r>
-        <w:rPr>
-          <w:i/>
-        </w:rPr>
-        <w:t>Carla les va a abrir el PLC y el circuito. Caleb, la innovación.</w:t>
-      </w:r>
-    </w:p>
-    <w:p>
-      <w:pPr>
-        <w:ind w:left="360"/>
-      </w:pPr>
-      <w:r>
-        <w:rPr>
-          <w:i/>
-        </w:rPr>
-        <w:t>Y al final… les tenemos una sorpresa física.”</w:t>
-      </w:r>
-    </w:p>
-    <w:p>
-      <w:r>
-        <w:t>Puente (3:40):</w:t>
-      </w:r>
-    </w:p>
-    <w:p>
-      <w:pPr>
-        <w:ind w:left="360"/>
-      </w:pPr>
-      <w:r>
-        <w:rPr>
-          <w:i/>
-        </w:rPr>
-        <w:t>“Carla, te paso el lead. Muéstrales por qué esto no es solo una idea bonita: es LAD, timers y un bus de datos limpio.”</w:t>
+        <w:t>Caleb: la capa que el usuario toca.”</w:t>
       </w:r>
     </w:p>
     <w:p>
@@ -643,15 +910,20 @@
         <w:pStyle w:val="Title"/>
       </w:pPr>
       <w:r>
-        <w:t>BLOQUE 2 — Carla (4:00 → 9:10)</w:t>
+        <w:t>BLOQUE 3 — Caleb (6:00 → 9:00)</w:t>
       </w:r>
     </w:p>
     <w:p>
       <w:pPr>
-        <w:pStyle w:val="Heading1"/>
+        <w:pStyle w:val="Heading2"/>
       </w:pPr>
       <w:r>
-        <w:t>TIA Portal (20) + Automation Studio (15) + KEP · el bloque más pesado</w:t>
+        <w:t>6:00–6:40 · Innovación (~40 s)</w:t>
+      </w:r>
+    </w:p>
+    <w:p>
+      <w:r>
+        <w:t>Caleb (abre la web):</w:t>
       </w:r>
     </w:p>
     <w:p>
@@ -662,20 +934,7 @@
         <w:rPr>
           <w:i/>
         </w:rPr>
-        <w:t>**Tono:** ingeniera a ingenieros. Digan tags, DBs, TON, por qué `%M` y no solo `I/Q` en sim.</w:t>
-      </w:r>
-    </w:p>
-    <w:p>
-      <w:pPr>
-        <w:pStyle w:val="Heading2"/>
-      </w:pPr>
-      <w:r>
-        <w:t>4:00–4:40 · Arquitectura (1 diagrama)</w:t>
-      </w:r>
-    </w:p>
-    <w:p>
-      <w:r>
-        <w:t>Carla (comparte pantalla: diagrama AS ↔ KEP ↔ TIA/PLCSIM):</w:t>
+        <w:t>“La innovación no fue otra KTP en el rack.</w:t>
       </w:r>
     </w:p>
     <w:p>
@@ -686,7 +945,7 @@
         <w:rPr>
           <w:i/>
         </w:rPr>
-        <w:t>“Buenas. Soy Carla.</w:t>
+        <w:t>Fue preguntar: ¿quién usa esto en un colegio o un parque? Un celular.</w:t>
       </w:r>
     </w:p>
     <w:p>
@@ -697,7 +956,7 @@
         <w:rPr>
           <w:i/>
         </w:rPr>
-        <w:t>Stack: **TIA Portal V20**, CPU **1511C** en **PLCSIM Advanced**, **Automation Studio 10**, puente **KEPServerEX 6**.</w:t>
+        <w:t>Por eso SIBU web: app de usuario con kilos y colones; HMI virtual tipo Comfort; puente plc_bridge.py Firestore ↔ snap7 ↔ DBs.</w:t>
       </w:r>
     </w:p>
     <w:p>
@@ -708,7 +967,20 @@
         <w:rPr>
           <w:i/>
         </w:rPr>
-        <w:t>Automation Studio no habla S7 nativo con comodidad; por eso KEPServer mueve tags hacia memorias del PLC.</w:t>
+        <w:t>El navegador no habla S7. El bridge sí.”</w:t>
+      </w:r>
+    </w:p>
+    <w:p>
+      <w:pPr>
+        <w:pStyle w:val="Heading2"/>
+      </w:pPr>
+      <w:r>
+        <w:t>6:40–8:10 · HMI (~1:30)</w:t>
+      </w:r>
+    </w:p>
+    <w:p>
+      <w:r>
+        <w:t>Habla (~40 s):</w:t>
       </w:r>
     </w:p>
     <w:p>
@@ -719,7 +991,7 @@
         <w:rPr>
           <w:i/>
         </w:rPr>
-        <w:t>En simulación usamos **`%M`** para sensores y actuadores compartidos con AS.</w:t>
+        <w:t>“En la HMI: Start, Stop, emergencia, auto/manual, peso.</w:t>
       </w:r>
     </w:p>
     <w:p>
@@ -730,20 +1002,7 @@
         <w:rPr>
           <w:i/>
         </w:rPr>
-        <w:t>La web no toca I/Q a lo loco: escribe **`DB_HMI`** y lee **`DatosEstacion`**.”</w:t>
-      </w:r>
-    </w:p>
-    <w:p>
-      <w:pPr>
-        <w:pStyle w:val="Heading2"/>
-      </w:pPr>
-      <w:r>
-        <w:t>4:40–7:10 · Programación PLC en TIA (apunten a los 20 pts)</w:t>
-      </w:r>
-    </w:p>
-    <w:p>
-      <w:r>
-        <w:t>Carla (TIA: OB1 + FCs + un network clave en pantalla grande):</w:t>
+        <w:t>Comandos a DB_HMI. Estado desde DatosEstacion: banda, pistones, contadores, alarmas.</w:t>
       </w:r>
     </w:p>
     <w:p>
@@ -754,7 +1013,20 @@
         <w:rPr>
           <w:i/>
         </w:rPr>
-        <w:t>“Software estructurado en cuatro funciones:</w:t>
+        <w:t>Al usuario le mostramos progreso y recompensa, no tags. Misma verdad de proceso, dos lenguajes.”</w:t>
+      </w:r>
+    </w:p>
+    <w:p>
+      <w:r>
+        <w:t>Demo clicks (~50 s): pantalla completa → Start → un ciclo plástico o aluminio → señalar contadores. Pocas palabras mientras clickean.</w:t>
+      </w:r>
+    </w:p>
+    <w:p>
+      <w:pPr>
+        <w:pStyle w:val="Heading2"/>
+      </w:pPr>
+      <w:r>
+        <w:t>8:10–8:35 · Tres mejoras (~25 s)</w:t>
       </w:r>
     </w:p>
     <w:p>
@@ -765,7 +1037,7 @@
         <w:rPr>
           <w:i/>
         </w:rPr>
-        <w:t>- **`FC_Modos`:** Start / Stop / Emergencia / modo auto — latches limpios, sin pelear bobinas.</w:t>
+        <w:t>“Uno: HMI usable en remoto y en sitio.</w:t>
       </w:r>
     </w:p>
     <w:p>
@@ -776,7 +1048,7 @@
         <w:rPr>
           <w:i/>
         </w:rPr>
-        <w:t>- **`FC_Secuencia`:** banda, detección de material, secuencia de clasificación, conteo.</w:t>
+        <w:t>Dos: contrato de datos con offsets fijos.</w:t>
       </w:r>
     </w:p>
     <w:p>
@@ -787,7 +1059,7 @@
         <w:rPr>
           <w:i/>
         </w:rPr>
-        <w:t>- **`FC_Alarmas`:** timeout de pistón, sensores contradictorios, reset.</w:t>
+        <w:t>Tres: la app no se rehace si cambiamos de PLCSIM a hardware.</w:t>
       </w:r>
     </w:p>
     <w:p>
@@ -798,12 +1070,15 @@
         <w:rPr>
           <w:i/>
         </w:rPr>
-        <w:t>- **`FC_EspejoWeb`:** copia estado a `DatosEstacion` para la app.</w:t>
+        <w:t>Innovación aplicada a Siemens, no una landing.”</w:t>
       </w:r>
     </w:p>
     <w:p>
+      <w:pPr>
+        <w:pStyle w:val="Heading2"/>
+      </w:pPr>
       <w:r>
-        <w:t>&gt;</w:t>
+        <w:t>8:35–9:00 · Ciclo integral narrado (~25 s)</w:t>
       </w:r>
     </w:p>
     <w:p>
@@ -814,7 +1089,7 @@
         <w:rPr>
           <w:i/>
         </w:rPr>
-        <w:t>Detalle que importa en evaluación:</w:t>
+        <w:t>“Ciclo: pieza → peso → banda → material → clasificación → conteo → recompensa.</w:t>
       </w:r>
     </w:p>
     <w:p>
@@ -825,7 +1100,7 @@
         <w:rPr>
           <w:i/>
         </w:rPr>
-        <w:t>- Una sola bobina por actuador: **AUTO // MANUAL en paralelo**, no doble escritura.</w:t>
+        <w:t>Timeout o sensores cruzados: alarma. Emergencia: paro.</w:t>
       </w:r>
     </w:p>
     <w:p>
@@ -836,148 +1111,7 @@
         <w:rPr>
           <w:i/>
         </w:rPr>
-        <w:t>- Timers **TON IEC** — retardo de clasificación y timeout de seguridad.</w:t>
-      </w:r>
-    </w:p>
-    <w:p>
-      <w:pPr>
-        <w:ind w:left="360"/>
-      </w:pPr>
-      <w:r>
-        <w:rPr>
-          <w:i/>
-        </w:rPr>
-        <w:t>- Data Blocks con **Optimized access OFF** porque el bridge usa offsets fijos (snap7).</w:t>
-      </w:r>
-    </w:p>
-    <w:p>
-      <w:pPr>
-        <w:ind w:left="360"/>
-      </w:pPr>
-      <w:r>
-        <w:rPr>
-          <w:i/>
-        </w:rPr>
-        <w:t>- Contrato claro: comandos en **DB3 `DB_HMI`**, estado en **DB1 `DatosEstacion`**.”</w:t>
-      </w:r>
-    </w:p>
-    <w:p>
-      <w:r>
-        <w:t>*(Si pueden: 20–30 s de ONLINE / force o simulación corta de un ciclo plástico vs aluminio.)*</w:t>
-      </w:r>
-    </w:p>
-    <w:p>
-      <w:pPr>
-        <w:ind w:left="360"/>
-      </w:pPr>
-      <w:r>
-        <w:rPr>
-          <w:i/>
-        </w:rPr>
-        <w:t>“En el camino a hardware real también diseñamos la variante **S7-1200 1214C** con I/Q físicos y **tres pistones**: retenedor, empuje plástico y empuje aluminio — misma lógica de producto, distinto mapa de campo.”</w:t>
-      </w:r>
-    </w:p>
-    <w:p>
-      <w:pPr>
-        <w:pStyle w:val="Heading2"/>
-      </w:pPr>
-      <w:r>
-        <w:t>7:10–9:00 · Automation Studio + KEPServer (15 pts)</w:t>
-      </w:r>
-    </w:p>
-    <w:p>
-      <w:r>
-        <w:t>Carla (AS en pantalla: cilindro, 5/2, sensores 0%/100%):</w:t>
-      </w:r>
-    </w:p>
-    <w:p>
-      <w:pPr>
-        <w:ind w:left="360"/>
-      </w:pPr>
-      <w:r>
-        <w:rPr>
-          <w:i/>
-        </w:rPr>
-        <w:t>“En Automation Studio modelamos la estación electroneumática:</w:t>
-      </w:r>
-    </w:p>
-    <w:p>
-      <w:pPr>
-        <w:ind w:left="360"/>
-      </w:pPr>
-      <w:r>
-        <w:rPr>
-          <w:i/>
-        </w:rPr>
-        <w:t>fuente → válvula **5/2** → cilindro de doble efecto → referencias de sensor en **0% y 100%**.</w:t>
-      </w:r>
-    </w:p>
-    <w:p>
-      <w:r>
-        <w:t>&gt;</w:t>
-      </w:r>
-    </w:p>
-    <w:p>
-      <w:pPr>
-        <w:ind w:left="360"/>
-      </w:pPr>
-      <w:r>
-        <w:rPr>
-          <w:i/>
-        </w:rPr>
-        <w:t>KEPServer enlaza esas variables a tags del PLC.</w:t>
-      </w:r>
-    </w:p>
-    <w:p>
-      <w:pPr>
-        <w:ind w:left="360"/>
-      </w:pPr>
-      <w:r>
-        <w:rPr>
-          <w:i/>
-        </w:rPr>
-        <w:t>Cuando el PLC pone el solenoide, AS mueve el vástago; cuando llega a 100%, el sensor regresa al PLC y la secuencia avanza.</w:t>
-      </w:r>
-    </w:p>
-    <w:p>
-      <w:pPr>
-        <w:ind w:left="360"/>
-      </w:pPr>
-      <w:r>
-        <w:rPr>
-          <w:i/>
-        </w:rPr>
-        <w:t>Eso cierra el lazo: **no es un GIF, es feedback de proceso**.”</w:t>
-      </w:r>
-    </w:p>
-    <w:p>
-      <w:pPr>
-        <w:pStyle w:val="Heading2"/>
-      </w:pPr>
-      <w:r>
-        <w:t>9:00–9:10 · Handoff a Caleb</w:t>
-      </w:r>
-    </w:p>
-    <w:p>
-      <w:pPr>
-        <w:ind w:left="360"/>
-      </w:pPr>
-      <w:r>
-        <w:rPr>
-          <w:i/>
-        </w:rPr>
-        <w:t>“Hasta aquí: cerebro Siemens + músculo neumático.</w:t>
-      </w:r>
-    </w:p>
-    <w:p>
-      <w:pPr>
-        <w:ind w:left="360"/>
-      </w:pPr>
-      <w:r>
-        <w:rPr>
-          <w:i/>
-        </w:rPr>
-        <w:t>Caleb les muestra la capa que el usuario toca — y por qué eso es nuestra innovación.”</w:t>
+        <w:t>Un sistema, no tres demos sueltas. Ahora lo corremos junto.”</w:t>
       </w:r>
     </w:p>
     <w:p>
@@ -990,283 +1124,47 @@
         <w:pStyle w:val="Title"/>
       </w:pPr>
       <w:r>
-        <w:t>BLOQUE 3 — Caleb (9:25 → 12:10)</w:t>
-      </w:r>
-    </w:p>
-    <w:p>
-      <w:pPr>
-        <w:pStyle w:val="Heading1"/>
-      </w:pPr>
-      <w:r>
-        <w:t>HMI (15) + Innovación (10)</w:t>
-      </w:r>
-    </w:p>
-    <w:p>
-      <w:pPr>
-        <w:pStyle w:val="Heading2"/>
-      </w:pPr>
-      <w:r>
-        <w:t>9:25–10:20 · La apuesta de innovación</w:t>
+        <w:t>BLOQUE 4 — Demo integral (9:00 → 12:30) · ~3:30</w:t>
       </w:r>
     </w:p>
     <w:p>
       <w:r>
-        <w:t>Caleb (abre la web / GitHub Pages):</w:t>
-      </w:r>
-    </w:p>
-    <w:p>
-      <w:pPr>
-        <w:ind w:left="360"/>
-      </w:pPr>
-      <w:r>
-        <w:rPr>
-          <w:i/>
-        </w:rPr>
-        <w:t>“La innovación no fue poner otra KTP en el rack.</w:t>
-      </w:r>
-    </w:p>
-    <w:p>
-      <w:pPr>
-        <w:ind w:left="360"/>
-      </w:pPr>
-      <w:r>
-        <w:rPr>
-          <w:i/>
-        </w:rPr>
-        <w:t>Fue preguntarnos: ¿quién usa la estación en un colegio o un parque?</w:t>
-      </w:r>
-    </w:p>
-    <w:p>
-      <w:pPr>
-        <w:ind w:left="360"/>
-      </w:pPr>
-      <w:r>
-        <w:rPr>
-          <w:i/>
-        </w:rPr>
-        <w:t>Un estudiante con el celular. Un docente. Un jurado remoto.</w:t>
+        <w:t>Objetivo: que el jurado *vea* TIA/AS/web alineados.</w:t>
       </w:r>
     </w:p>
     <w:p>
       <w:r>
-        <w:t>&gt;</w:t>
-      </w:r>
-    </w:p>
-    <w:p>
-      <w:pPr>
-        <w:ind w:left="360"/>
-      </w:pPr>
-      <w:r>
-        <w:rPr>
-          <w:i/>
-        </w:rPr>
-        <w:t>Entonces construimos **SIBU web**:</w:t>
-      </w:r>
-    </w:p>
-    <w:p>
-      <w:pPr>
-        <w:ind w:left="360"/>
-      </w:pPr>
-      <w:r>
-        <w:rPr>
-          <w:i/>
-        </w:rPr>
-        <w:t>- App de usuario: sesión, materiales, kilos, recompensa en **colones**.</w:t>
-      </w:r>
-    </w:p>
-    <w:p>
-      <w:pPr>
-        <w:ind w:left="360"/>
-      </w:pPr>
-      <w:r>
-        <w:rPr>
-          <w:i/>
-        </w:rPr>
-        <w:t>- **HMI virtual** estilo Comfort/KTP para operar como panel industrial.</w:t>
-      </w:r>
-    </w:p>
-    <w:p>
-      <w:pPr>
-        <w:ind w:left="360"/>
-      </w:pPr>
-      <w:r>
-        <w:rPr>
-          <w:i/>
-        </w:rPr>
-        <w:t>- Puente **`plc_bridge.py`**: Firestore ↔ snap7 ↔ DBs del PLC.</w:t>
+        <w:t>No lean guion aquí. Solo cues:</w:t>
       </w:r>
     </w:p>
     <w:p>
       <w:r>
-        <w:t>&gt;</w:t>
-      </w:r>
-    </w:p>
-    <w:p>
-      <w:pPr>
-        <w:ind w:left="360"/>
-      </w:pPr>
-      <w:r>
-        <w:rPr>
-          <w:i/>
-        </w:rPr>
-        <w:t>El navegador no habla S7. El bridge sí. Eso es diseño de sistema, no maquillaje.”</w:t>
-      </w:r>
-    </w:p>
-    <w:p>
-      <w:pPr>
-        <w:pStyle w:val="Heading2"/>
-      </w:pPr>
-      <w:r>
-        <w:t>10:20–11:40 · HMI: qué hace (demo viva)</w:t>
+        <w:t>1. Caleb: “Arrancamos sesión / Start.”</w:t>
       </w:r>
     </w:p>
     <w:p>
       <w:r>
-        <w:t>Caleb (HMI a pantalla completa si pueden):</w:t>
-      </w:r>
-    </w:p>
-    <w:p>
-      <w:pPr>
-        <w:ind w:left="360"/>
-      </w:pPr>
-      <w:r>
-        <w:rPr>
-          <w:i/>
-        </w:rPr>
-        <w:t>“En la HMI el operador manda Start, Stop, emergencia, modo auto/manual, peso y — en la versión real — **Extender/Retractar** de cada pistón.</w:t>
-      </w:r>
-    </w:p>
-    <w:p>
-      <w:pPr>
-        <w:ind w:left="360"/>
-      </w:pPr>
-      <w:r>
-        <w:rPr>
-          <w:i/>
-        </w:rPr>
-        <w:t>Los comandos caen en `DB_HMI`.</w:t>
-      </w:r>
-    </w:p>
-    <w:p>
-      <w:pPr>
-        <w:ind w:left="360"/>
-      </w:pPr>
-      <w:r>
-        <w:rPr>
-          <w:i/>
-        </w:rPr>
-        <w:t>El estado vuelve por `DatosEstacion`: banda, pistones, contadores, alarmas.</w:t>
+        <w:t>2. Carla (si AS/TIA en su pantalla, o Caleb si todo está en una): ciclo plástico.</w:t>
       </w:r>
     </w:p>
     <w:p>
       <w:r>
-        <w:t>&gt;</w:t>
-      </w:r>
-    </w:p>
-    <w:p>
-      <w:pPr>
-        <w:ind w:left="360"/>
-      </w:pPr>
-      <w:r>
-        <w:rPr>
-          <w:i/>
-        </w:rPr>
-        <w:t>Para el usuario final no mostramos tags: mostramos progreso y recompensa.</w:t>
-      </w:r>
-    </w:p>
-    <w:p>
-      <w:pPr>
-        <w:ind w:left="360"/>
-      </w:pPr>
-      <w:r>
-        <w:rPr>
-          <w:i/>
-        </w:rPr>
-        <w:t>Misma verdad de proceso, dos lenguajes: industrial y humano.”</w:t>
+        <w:t>3. Ciclo aluminio / clasificación.</w:t>
       </w:r>
     </w:p>
     <w:p>
       <w:r>
-        <w:t>*(Click real: Start → simular plástico/aluminio o mostrar sesión en vivo. 30–40 s máximo.)*</w:t>
-      </w:r>
-    </w:p>
-    <w:p>
-      <w:pPr>
-        <w:pStyle w:val="Heading2"/>
-      </w:pPr>
-      <w:r>
-        <w:t>11:40–12:10 · Por qué esto suma innovación técnica</w:t>
-      </w:r>
-    </w:p>
-    <w:p>
-      <w:pPr>
-        <w:ind w:left="360"/>
-      </w:pPr>
-      <w:r>
-        <w:rPr>
-          <w:i/>
-        </w:rPr>
-        <w:t>“Mejora técnica concreta:</w:t>
-      </w:r>
-    </w:p>
-    <w:p>
-      <w:pPr>
-        <w:ind w:left="360"/>
-      </w:pPr>
-      <w:r>
-        <w:rPr>
-          <w:i/>
-        </w:rPr>
-        <w:t>1) HMI remota usable en defensa virtual y en sitio.</w:t>
-      </w:r>
-    </w:p>
-    <w:p>
-      <w:pPr>
-        <w:ind w:left="360"/>
-      </w:pPr>
-      <w:r>
-        <w:rPr>
-          <w:i/>
-        </w:rPr>
-        <w:t>2) Contrato de datos versionado (offsets, DBs).</w:t>
-      </w:r>
-    </w:p>
-    <w:p>
-      <w:pPr>
-        <w:ind w:left="360"/>
-      </w:pPr>
-      <w:r>
-        <w:rPr>
-          <w:i/>
-        </w:rPr>
-        <w:t>3) Camino a PLC real 1214C sin rehacer la app.</w:t>
-      </w:r>
-    </w:p>
-    <w:p>
-      <w:pPr>
-        <w:ind w:left="360"/>
-      </w:pPr>
-      <w:r>
-        <w:rPr>
-          <w:i/>
-        </w:rPr>
-        <w:t>Eso es innovación aplicada a Siemens, no una landing page decorativa.”</w:t>
+        <w:t>4. Señalar contador + app.</w:t>
       </w:r>
     </w:p>
     <w:p>
       <w:r>
-        <w:t>Puente:</w:t>
+        <w:t>5. (Opcional 15 s) emergencia o alarma.</w:t>
       </w:r>
     </w:p>
     <w:p>
-      <w:pPr>
-        <w:ind w:left="360"/>
-      </w:pPr>
       <w:r>
-        <w:rPr>
-          <w:i/>
-        </w:rPr>
-        <w:t>“Ahora el criterio que amarra todo: funcionamiento integral. Y la sorpresa.”</w:t>
+        <w:t>Si algo falla: pasen al siguiente material; no depuren en vivo más de 20 s.</w:t>
       </w:r>
     </w:p>
     <w:p>
@@ -1279,20 +1177,17 @@
         <w:pStyle w:val="Title"/>
       </w:pPr>
       <w:r>
-        <w:t>BLOQUE 4 — Funcionamiento integral + sorpresa física (12:10 → 14:10) · 15 pts + boost innovación</w:t>
-      </w:r>
-    </w:p>
-    <w:p>
-      <w:pPr>
-        <w:pStyle w:val="Heading2"/>
-      </w:pPr>
-      <w:r>
-        <w:t>12:10–12:50 · Ciclo integral (narrado en 40 s)</w:t>
+        <w:t>BLOQUE 5 — Cierre físico (12:30 → 14:20) · primera mención</w:t>
       </w:r>
     </w:p>
     <w:p>
       <w:r>
-        <w:t>Caleb o Edgar (mientras se ve el flujo):</w:t>
+        <w:t>Aquí es la primera vez que hablan de llevarlo a mesa física.</w:t>
+      </w:r>
+    </w:p>
+    <w:p>
+      <w:r>
+        <w:t>Edgar (~20 s):</w:t>
       </w:r>
     </w:p>
     <w:p>
@@ -1303,7 +1198,7 @@
         <w:rPr>
           <w:i/>
         </w:rPr>
-        <w:t>“Ciclo completo:</w:t>
+        <w:t>“Hasta ahora vieron el sistema en simulación y software.</w:t>
       </w:r>
     </w:p>
     <w:p>
@@ -1314,7 +1209,12 @@
         <w:rPr>
           <w:i/>
         </w:rPr>
-        <w:t>pieza → peso → banda → material → clasificación → conteo → recompensa en app.</w:t>
+        <w:t>La pregunta de todo jurado Siemens es: ¿esto baja a campo?”</w:t>
+      </w:r>
+    </w:p>
+    <w:p>
+      <w:r>
+        <w:t>Caleb (~40–50 s, cámara a la mesa / video corto):</w:t>
       </w:r>
     </w:p>
     <w:p>
@@ -1325,7 +1225,7 @@
         <w:rPr>
           <w:i/>
         </w:rPr>
-        <w:t>Si hay timeout o sensores contradictorios: alarma.</w:t>
+        <w:t>“Sí. Estamos montando SIBU en físico: banda, sensores y tres pistones — retenedor, plástico, aluminio — con mando desde la misma web.</w:t>
       </w:r>
     </w:p>
     <w:p>
@@ -1336,7 +1236,12 @@
         <w:rPr>
           <w:i/>
         </w:rPr>
-        <w:t>Si hay emergencia: paro.</w:t>
+        <w:t>Sin botonera en mesa: opera el HMI.”</w:t>
+      </w:r>
+    </w:p>
+    <w:p>
+      <w:r>
+        <w:t>Carla (~10–15 s):</w:t>
       </w:r>
     </w:p>
     <w:p>
@@ -1347,66 +1252,12 @@
         <w:rPr>
           <w:i/>
         </w:rPr>
-        <w:t>Eso es funcionamiento integral: no tres demos sueltas, un sistema.”</w:t>
-      </w:r>
-    </w:p>
-    <w:p>
-      <w:pPr>
-        <w:pStyle w:val="Heading2"/>
-      </w:pPr>
-      <w:r>
-        <w:t>12:50–14:10 · SORPRESA — enfoque físico</w:t>
+        <w:t>“Eso es pasar de %M/AS a I/Q en 1214C, mismo contrato de DBs.”</w:t>
       </w:r>
     </w:p>
     <w:p>
       <w:r>
-        <w:t>Coreografía sugerida (virtual):</w:t>
-      </w:r>
-    </w:p>
-    <w:p>
-      <w:r>
-        <w:t>1. Edgar:</w:t>
-      </w:r>
-    </w:p>
-    <w:p>
-      <w:r>
-        <w:t xml:space="preserve">   &gt; “Hasta ahora vieron simulación y software. La pregunta del jurado siempre es: ¿esto vive fuera de la laptop?”</w:t>
-      </w:r>
-    </w:p>
-    <w:p>
-      <w:r>
-        <w:t>2. Caleb acerca la cámara / comparte video corto / muestra mesa:</w:t>
-      </w:r>
-    </w:p>
-    <w:p>
-      <w:r>
-        <w:t xml:space="preserve">   &gt; “Estamos llevando SIBU a físico: estación real con banda, sensores y tres pistones — retenedor, plástico, aluminio — operada desde la misma web. Sin botonera: el mando es el HMI.”</w:t>
-      </w:r>
-    </w:p>
-    <w:p>
-      <w:r>
-        <w:t>3. Carla (10 s, refuerzo Siemens):</w:t>
-      </w:r>
-    </w:p>
-    <w:p>
-      <w:r>
-        <w:t xml:space="preserve">   &gt; “Eso implica pasar de tags %M/AS a I/Q reales en 1214C, manteniendo el mismo contrato de DBs. Misma lógica de producto, otro nivel de campo.”</w:t>
-      </w:r>
-    </w:p>
-    <w:p>
-      <w:r>
-        <w:t>No prometan hardware que no puedan mostrar. Si el físico está a medias:</w:t>
-      </w:r>
-    </w:p>
-    <w:p>
-      <w:pPr>
-        <w:ind w:left="360"/>
-      </w:pPr>
-      <w:r>
-        <w:rPr>
-          <w:i/>
-        </w:rPr>
-        <w:t>“Esta es la mesa en construcción / la prueba de concepto física; el software ya está listo para alimentarla.”</w:t>
+        <w:t>Si el hardware está a medias, digan exactamente eso — sin overclaim.</w:t>
       </w:r>
     </w:p>
     <w:p>
@@ -1419,12 +1270,12 @@
         <w:pStyle w:val="Title"/>
       </w:pPr>
       <w:r>
-        <w:t>BLOQUE 5 — Cierre (14:10 → 15:00)</w:t>
+        <w:t>BLOQUE 6 — Cierre (14:20 → 15:00) · ~40 s</w:t>
       </w:r>
     </w:p>
     <w:p>
       <w:r>
-        <w:t>Edgar:</w:t>
+        <w:t>Edgar (~25 s):</w:t>
       </w:r>
     </w:p>
     <w:p>
@@ -1435,7 +1286,7 @@
         <w:rPr>
           <w:i/>
         </w:rPr>
-        <w:t>“SIBU ataca un problema real de cultura de reciclaje con una respuesta de automatización:</w:t>
+        <w:t>“SIBU responde a un problema real de reciclaje con automatización: clasifica, mide y recompensa.</w:t>
       </w:r>
     </w:p>
     <w:p>
@@ -1446,7 +1297,7 @@
         <w:rPr>
           <w:i/>
         </w:rPr>
-        <w:t>clasifica, mide y recompensa.</w:t>
+        <w:t>Siemens en el núcleo. Web como puente al usuario.</w:t>
       </w:r>
     </w:p>
     <w:p>
@@ -1457,23 +1308,12 @@
         <w:rPr>
           <w:i/>
         </w:rPr>
-        <w:t>Siemens en el núcleo. Una web como puente al mundo real.</w:t>
-      </w:r>
-    </w:p>
-    <w:p>
-      <w:pPr>
-        <w:ind w:left="360"/>
-      </w:pPr>
-      <w:r>
-        <w:rPr>
-          <w:i/>
-        </w:rPr>
-        <w:t>Y una estación pensada para colegios y espacios públicos en Costa Rica.”</w:t>
+        <w:t>Estación pensada para colegios y espacios públicos en Costa Rica.”</w:t>
       </w:r>
     </w:p>
     <w:p>
       <w:r>
-        <w:t>Cada uno, una línea (ensayen, suena a banda):</w:t>
+        <w:t>Una línea cada uno (~15 s total):</w:t>
       </w:r>
     </w:p>
     <w:p>
@@ -1481,7 +1321,7 @@
         <w:pStyle w:val="ListBullet"/>
       </w:pPr>
       <w:r>
-        <w:t>**Carla:** “PLC estructurado, seguro y listo para campo.”</w:t>
+        <w:t>Carla: “PLC estructurado y listo para campo.”</w:t>
       </w:r>
     </w:p>
     <w:p>
@@ -1489,7 +1329,7 @@
         <w:pStyle w:val="ListBullet"/>
       </w:pPr>
       <w:r>
-        <w:t>**Caleb:** “Innovación que un estudiante puede tocar con el celular.”</w:t>
+        <w:t>Caleb: “Innovación que se toca con el celular.”</w:t>
       </w:r>
     </w:p>
     <w:p>
@@ -1497,7 +1337,7 @@
         <w:pStyle w:val="ListBullet"/>
       </w:pPr>
       <w:r>
-        <w:t>**Edgar:** “Gracias. Quedamos abiertos a sus preguntas técnicas.”</w:t>
+        <w:t>Edgar: “Gracias. Quedamos abiertos a preguntas técnicas.”</w:t>
       </w:r>
     </w:p>
     <w:p>
@@ -1510,7 +1350,7 @@
         <w:pStyle w:val="Heading1"/>
       </w:pPr>
       <w:r>
-        <w:t>Frases prohibidas (suenan a feria escolar)</w:t>
+        <w:t>Frases prohibidas</w:t>
       </w:r>
     </w:p>
     <w:p>
@@ -1534,7 +1374,7 @@
         <w:pStyle w:val="ListBullet"/>
       </w:pPr>
       <w:r>
-        <w:t>“No alcanzó el tiempo para alarmas/timers…”</w:t>
+        <w:t>“KEPServer es un programa que conecta cosas” → digan tags / OPC / %M</w:t>
       </w:r>
     </w:p>
     <w:p>
@@ -1542,7 +1382,7 @@
         <w:pStyle w:val="ListBullet"/>
       </w:pPr>
       <w:r>
-        <w:t>“KEPServer es un programa que conecta cosas” *(digan **tags / OPC / `%M`**)*</w:t>
+        <w:t>Cualquier “al final tenemos una sorpresa…” antes del minuto 12:30</w:t>
       </w:r>
     </w:p>
     <w:p>
@@ -1590,7 +1430,7 @@
         <w:pStyle w:val="ListBullet"/>
       </w:pPr>
       <w:r>
-        <w:t>“La HMI web escribe `DB_HMI`; no reemplaza la lógica del PLC.”</w:t>
+        <w:t>“La HMI web escribe DB_HMI; no reemplaza la lógica del PLC.”</w:t>
       </w:r>
     </w:p>
     <w:p>
@@ -1603,7 +1443,7 @@
         <w:pStyle w:val="Heading1"/>
       </w:pPr>
       <w:r>
-        <w:t>Checklist de ensayo (1 corrida cronometrada)</w:t>
+        <w:t>Checklist de ensayo (cronometrar en serio)</w:t>
       </w:r>
     </w:p>
     <w:p>
@@ -1611,7 +1451,7 @@
         <w:pStyle w:val="ListBullet"/>
       </w:pPr>
       <w:r>
-        <w:t>[ ] Edgar abre sin leer el celular</w:t>
+        <w:t>Edgar bloque completo ≤ 2:25</w:t>
       </w:r>
     </w:p>
     <w:p>
@@ -1619,7 +1459,7 @@
         <w:pStyle w:val="ListBullet"/>
       </w:pPr>
       <w:r>
-        <w:t>[ ] Carla tiene TIA + AS listos (ventanas acomodadas)</w:t>
+        <w:t>Carla habla+shows ≤ 3:35 (hasta handoff)</w:t>
       </w:r>
     </w:p>
     <w:p>
@@ -1627,7 +1467,7 @@
         <w:pStyle w:val="ListBullet"/>
       </w:pPr>
       <w:r>
-        <w:t>[ ] Caleb tiene HMI en pantalla completa y un ciclo demo que no falle</w:t>
+        <w:t>Caleb hasta ciclo integral ≤ 3:00</w:t>
       </w:r>
     </w:p>
     <w:p>
@@ -1635,7 +1475,7 @@
         <w:pStyle w:val="ListBullet"/>
       </w:pPr>
       <w:r>
-        <w:t>[ ] Cambio de pantalla Edgar→Carla→Caleb &amp;lt; 15 s</w:t>
+        <w:t>Demo integral ensayada una vez sin guion</w:t>
       </w:r>
     </w:p>
     <w:p>
@@ -1643,7 +1483,7 @@
         <w:pStyle w:val="ListBullet"/>
       </w:pPr>
       <w:r>
-        <w:t>[ ] Sorpresa física ensayada (ángulo de cámara)</w:t>
+        <w:t>Físico no aparece en cámara antes del 12:30</w:t>
       </w:r>
     </w:p>
     <w:p>
@@ -1651,15 +1491,7 @@
         <w:pStyle w:val="ListBullet"/>
       </w:pPr>
       <w:r>
-        <w:t>[ ] Cierre a los 14:50, no a los 16:00</w:t>
-      </w:r>
-    </w:p>
-    <w:p>
-      <w:pPr>
-        <w:pStyle w:val="ListBullet"/>
-      </w:pPr>
-      <w:r>
-        <w:t>[ ] Preguntas frecuentes listas (abajo)</w:t>
+        <w:t>Cierre a los 14:55</w:t>
       </w:r>
     </w:p>
     <w:p>
@@ -1672,57 +1504,57 @@
         <w:pStyle w:val="Heading1"/>
       </w:pPr>
       <w:r>
-        <w:t>Preguntas típicas del jurado (respuestas cortas)</w:t>
+        <w:t>Preguntas típicas (respuestas de 15–20 s)</w:t>
       </w:r>
     </w:p>
     <w:p>
       <w:r>
-        <w:t>1) ¿Por qué web y no solo Comfort Panel?</w:t>
+        <w:t>¿Por qué web y no solo Comfort Panel?</w:t>
       </w:r>
     </w:p>
     <w:p>
       <w:r>
-        <w:t>Porque la estación vive en colegios/parques: el usuario trae el celular; el operador igual puede usar HMI web. El PLC sigue siendo el master.</w:t>
+        <w:t>Usuario de colegio/parque trae celular; operador igual puede usar HMI web. El PLC sigue siendo el master.</w:t>
       </w:r>
     </w:p>
     <w:p>
       <w:r>
-        <w:t>2) ¿Qué pasa si se cae internet?</w:t>
+        <w:t>¿Si se cae internet?</w:t>
       </w:r>
     </w:p>
     <w:p>
       <w:r>
-        <w:t>El PLC puede seguir su lógica local; la app/bridge pierde telemetría. En sitio real se prioriza red local + bridge en PC de estación.</w:t>
+        <w:t>El PLC sigue local; se pierde telemetría/app. En sitio: bridge en PC de estación + red local.</w:t>
       </w:r>
     </w:p>
     <w:p>
       <w:r>
-        <w:t>3) ¿Dónde está la seguridad?</w:t>
+        <w:t>¿Seguridad?</w:t>
       </w:r>
     </w:p>
     <w:p>
       <w:r>
-        <w:t>Emergencia y stop en lógica; timeout de actuadores; en físico se suma E-stop cableado cuando el hardware lo permita.</w:t>
+        <w:t>Stop/emergencia/timeout en lógica; E-stop cableado cuando el hardware lo permita.</w:t>
       </w:r>
     </w:p>
     <w:p>
       <w:r>
-        <w:t>4) ¿Plástico y aluminio nada más?</w:t>
+        <w:t>¿Solo plástico y aluminio?</w:t>
       </w:r>
     </w:p>
     <w:p>
       <w:r>
-        <w:t>Alcance deliberado del prototipo (2 materiales). Arquitectura de tags/contadores extensible.</w:t>
+        <w:t>Alcance del prototipo a propósito; tags/contadores extensibles.</w:t>
       </w:r>
     </w:p>
     <w:p>
       <w:r>
-        <w:t>5) ¿Cuál fue el aporte de cada quien?</w:t>
+        <w:t>¿Aporte de cada quien?</w:t>
       </w:r>
     </w:p>
     <w:p>
       <w:r>
-        <w:t>Edgar: problema/propuesta/comunicación. Carla: TIA + AS + KEP. Caleb: web/HMI/bridge/innovación.</w:t>
+        <w:t>Edgar: problema/propuesta. Carla: TIA+AS+KEP. Caleb: web/HMI/bridge.</w:t>
       </w:r>
     </w:p>
     <w:p>
@@ -1735,7 +1567,7 @@
         <w:pStyle w:val="Heading1"/>
       </w:pPr>
       <w:r>
-        <w:t>Mini-cue cards (imprimir / segunda pantalla)</w:t>
+        <w:t>Cue cards (segunda pantalla)</w:t>
       </w:r>
     </w:p>
     <w:p>
@@ -1748,17 +1580,17 @@
     </w:p>
     <w:p>
       <w:r>
-        <w:t>1. Hook basura vs contenedor</w:t>
+        <w:t>1. Hook 35s</w:t>
       </w:r>
     </w:p>
     <w:p>
       <w:r>
-        <w:t>2. 3 fallas: clasificar / medir / incentivar</w:t>
+        <w:t>2. 3 fallas 40s</w:t>
       </w:r>
     </w:p>
     <w:p>
       <w:r>
-        <w:t>3. Estación modular colegio-parque</w:t>
+        <w:t>3. Estación + 3 capas 45s</w:t>
       </w:r>
     </w:p>
     <w:p>
@@ -1768,7 +1600,7 @@
     </w:p>
     <w:p>
       <w:r>
-        <w:t>5. Cierre + sorpresa</w:t>
+        <w:t>5. *(al final)* ¿Baja a campo? → cierre</w:t>
       </w:r>
     </w:p>
     <w:p>
@@ -1781,27 +1613,27 @@
     </w:p>
     <w:p>
       <w:r>
-        <w:t>1. Diagrama AS–KEP–TIA</w:t>
+        <w:t>1. Stack 35s</w:t>
       </w:r>
     </w:p>
     <w:p>
       <w:r>
-        <w:t>2. 4 FCs + DB_HMI / DatosEstacion</w:t>
+        <w:t>2. 4 FCs + Optimized OFF</w:t>
       </w:r>
     </w:p>
     <w:p>
       <w:r>
-        <w:t>3. AUTO//MANUAL, TON, Optimized OFF</w:t>
+        <w:t>3. Mostrar LAD 30–40s</w:t>
       </w:r>
     </w:p>
     <w:p>
       <w:r>
-        <w:t>4. AS 5/2 + sensores 0/100</w:t>
+        <w:t>4. AS 5/2 + 0/100</w:t>
       </w:r>
     </w:p>
     <w:p>
       <w:r>
-        <w:t>5. Paso a Caleb · refuerzo 1214C</w:t>
+        <w:t>5. Paso a Caleb</w:t>
       </w:r>
     </w:p>
     <w:p>
@@ -1814,27 +1646,27 @@
     </w:p>
     <w:p>
       <w:r>
-        <w:t>1. Innovación = HMI/app real para humanos</w:t>
+        <w:t>1. Por qué web 40s</w:t>
       </w:r>
     </w:p>
     <w:p>
       <w:r>
-        <w:t>2. Bridge snap7 + Firestore</w:t>
+        <w:t>2. HMI + clicks 1:30</w:t>
       </w:r>
     </w:p>
     <w:p>
       <w:r>
-        <w:t>3. Demo HMI (Start / ciclo)</w:t>
+        <w:t>3. 3 mejoras 25s</w:t>
       </w:r>
     </w:p>
     <w:p>
       <w:r>
-        <w:t>4. Camino a físico 3 pistones</w:t>
+        <w:t>4. Ciclo + demo integral</w:t>
       </w:r>
     </w:p>
     <w:p>
       <w:r>
-        <w:t>5. Una línea de cierre</w:t>
+        <w:t>5. *(solo al final)* mesa física 3 pistones</w:t>
       </w:r>
     </w:p>
     <w:sectPr>

</xml_diff>